<commit_message>
Trim report reference list from 17 to 8 sources
Drop secondary citations, rephrase the sentences that used them, and mark
priors that rest on judgement rather than a direct published figure.

Co-Authored-By: Claude Opus 5.5 <noreply@anthropic.com>
Claude-Session: https://claude.ai/code/session_01Bgw45LkcSV1jeeqXWJKgrY
</commit_message>
<xml_diff>
--- a/Bayesian_Heart_Disease/Bayesian_Heart_Disease_Report.docx
+++ b/Bayesian_Heart_Disease/Bayesian_Heart_Disease_Report.docx
@@ -138,7 +138,7 @@
         <w:spacing w:after="140"/>
       </w:pPr>
       <w:r>
-        <w:t xml:space="preserve">Coronary heart disease is still the leading cause of death in the United States (Tsao et al., 2023), and invasive coronary angiography remains the reference test for confirming it. Angiography is expensive and carries a small but real risk, and a large registry study found that only 37.6% of patients sent for elective angiography actually had obstructive disease (Patel et al., 2010). A tool that estimates a patient's probability of disease from cheaper information could help decide who really needs the invasive test.</w:t>
+        <w:t xml:space="preserve">Coronary heart disease is still one of the leading causes of death worldwide, and invasive coronary angiography remains the reference test for confirming it. Angiography is expensive and carries a small but real risk, and a large registry study found that only 37.6% of patients sent for elective angiography actually had obstructive disease (Patel et al., 2010). A tool that estimates a patient's probability of disease from cheaper information could help decide who really needs the invasive test.</w:t>
       </w:r>
     </w:p>
     <w:p>
@@ -214,7 +214,7 @@
         <w:spacing w:after="140"/>
       </w:pPr>
       <w:r>
-        <w:t xml:space="preserve">This idea is not new to cardiology. Diamond and Forrester (1979) showed more than forty years ago that the meaning of a stress test result depends heavily on the pre-test probability, which is Bayes' theorem in a clinical setting. Detrano et al. (1989), who collected the very data we use, built a probability algorithm along the same lines. Our contribution is to do it with modern probabilistic programming, check it carefully, and see where the literature and the data agree or disagree.</w:t>
+        <w:t xml:space="preserve">This idea is not new to cardiology. Diamond and Forrester (1979) showed more than forty years ago that the meaning of a stress test result depends heavily on the pre-test probability, which is Bayes' theorem in a clinical setting. The team that collected the very data we use built a probability algorithm along the same lines. Our contribution is to do it with modern probabilistic programming, check it carefully, and see where the literature and the data agree or disagree.</w:t>
       </w:r>
     </w:p>
     <w:p>
@@ -1792,7 +1792,7 @@
         <w:spacing w:after="140"/>
       </w:pPr>
       <w:r>
-        <w:t xml:space="preserve">Table 2 lists every prior and its source. Where we could not find a defensible number, we said so and used a vague prior. The clearest case is "asymptomatic" chest pain, which has no clean equivalent in the clinical literature.</w:t>
+        <w:t xml:space="preserve">Table 2 lists every prior and where it came from. Some priors rest directly on a published figure; others are our own judgement, guided by the same studies, and the table marks them as such. Where we could not find a defensible number at all, we said so and used a vague prior. The clearest case is "asymptomatic" chest pain, which has no clean equivalent in the clinical literature.</w:t>
       </w:r>
     </w:p>
     <w:p>
@@ -2154,7 +2154,7 @@
                 <w:sz w:val="19"/>
                 <w:szCs w:val="19"/>
               </w:rPr>
-              <w:t xml:space="preserve">Diamond &amp; Forrester (1979); Genders et al. (2011)</w:t>
+              <w:t xml:space="preserve">Diamond &amp; Forrester (1979)</w:t>
             </w:r>
           </w:p>
         </w:tc>
@@ -2304,7 +2304,7 @@
                 <w:sz w:val="19"/>
                 <w:szCs w:val="19"/>
               </w:rPr>
-              <w:t xml:space="preserve">Wilson et al. (1998)</w:t>
+              <w:t xml:space="preserve">Judgement: small risk-factor effect</w:t>
             </w:r>
           </w:p>
         </w:tc>
@@ -2454,7 +2454,7 @@
                 <w:sz w:val="19"/>
                 <w:szCs w:val="19"/>
               </w:rPr>
-              <w:t xml:space="preserve">Wilson et al. (1998)</w:t>
+              <w:t xml:space="preserve">Judgement: small risk-factor effect</w:t>
             </w:r>
           </w:p>
         </w:tc>
@@ -2604,7 +2604,7 @@
                 <w:sz w:val="19"/>
                 <w:szCs w:val="19"/>
               </w:rPr>
-              <w:t xml:space="preserve">Gibbons et al. (2002)</w:t>
+              <w:t xml:space="preserve">Judgement, guided by Gianrossi et al. (1989)</w:t>
             </w:r>
           </w:p>
         </w:tc>
@@ -2904,7 +2904,7 @@
                 <w:sz w:val="19"/>
                 <w:szCs w:val="19"/>
               </w:rPr>
-              <w:t xml:space="preserve">Diamond &amp; Forrester (1979); Genders et al. (2011)</w:t>
+              <w:t xml:space="preserve">Diamond &amp; Forrester (1979)</w:t>
             </w:r>
           </w:p>
         </w:tc>
@@ -3054,7 +3054,7 @@
                 <w:sz w:val="19"/>
                 <w:szCs w:val="19"/>
               </w:rPr>
-              <w:t xml:space="preserve">Wilson et al. (1998)</w:t>
+              <w:t xml:space="preserve">Judgement: small risk-factor effect</w:t>
             </w:r>
           </w:p>
         </w:tc>
@@ -3204,7 +3204,7 @@
                 <w:sz w:val="19"/>
                 <w:szCs w:val="19"/>
               </w:rPr>
-              <w:t xml:space="preserve">Gibbons et al. (2002)</w:t>
+              <w:t xml:space="preserve">Judgement, guided by Gianrossi et al. (1989)</w:t>
             </w:r>
           </w:p>
         </w:tc>
@@ -3354,7 +3354,7 @@
                 <w:sz w:val="19"/>
                 <w:szCs w:val="19"/>
               </w:rPr>
-              <w:t xml:space="preserve">Gibbons et al. (2002)</w:t>
+              <w:t xml:space="preserve">Judgement: small effect</w:t>
             </w:r>
           </w:p>
         </w:tc>
@@ -3954,7 +3954,7 @@
                 <w:sz w:val="19"/>
                 <w:szCs w:val="19"/>
               </w:rPr>
-              <w:t xml:space="preserve">Gibbons et al. (2002)</w:t>
+              <w:t xml:space="preserve">Judgement, guided by Gianrossi et al. (1989)</w:t>
             </w:r>
           </w:p>
         </w:tc>
@@ -4104,7 +4104,7 @@
                 <w:sz w:val="19"/>
                 <w:szCs w:val="19"/>
               </w:rPr>
-              <w:t xml:space="preserve">Gibbons et al. (2002)</w:t>
+              <w:t xml:space="preserve">Judgement, guided by Gianrossi et al. (1989)</w:t>
             </w:r>
           </w:p>
         </w:tc>
@@ -4554,7 +4554,7 @@
                 <w:sz w:val="19"/>
                 <w:szCs w:val="19"/>
               </w:rPr>
-              <w:t xml:space="preserve">Knuuti et al. (2020)</w:t>
+              <w:t xml:space="preserve">Judgement, guided by Knuuti et al. (2018)</w:t>
             </w:r>
           </w:p>
         </w:tc>
@@ -4821,7 +4821,7 @@
         <w:spacing w:after="140"/>
       </w:pPr>
       <w:r>
-        <w:t xml:space="preserve">We implemented the model in PyMC version 5 (Abril-Pla et al., 2023) and drew samples with the No-U-Turn Sampler (Hoffman &amp; Gelman, 2014): four chains, 1,500 tuning steps and 2,000 draws each, giving 8,000 posterior draws. Diagnostics and model comparison used ArviZ (Kumar et al., 2019).</w:t>
+        <w:t xml:space="preserve">We implemented the model in PyMC version 5 (Abril-Pla et al., 2023) and drew samples with the No-U-Turn Sampler: four chains, 1,500 tuning steps and 2,000 draws each, giving 8,000 posterior draws. Diagnostics and model comparison used the ArviZ library.</w:t>
       </w:r>
     </w:p>
     <w:p>
@@ -6670,7 +6670,7 @@
         <w:spacing w:after="140"/>
       </w:pPr>
       <w:r>
-        <w:t xml:space="preserve">A large |z| means the published effect and the local data disagree by more than their combined uncertainty can explain, in the spirit of Evans and Moshonov (2006). We used a deliberately sensitive cut-off of |z| &gt; 1.645 (two-sided p &lt; .10), since the cost of missing a conflict is higher than the cost of relaxing a prior unnecessarily.</w:t>
+        <w:t xml:space="preserve">A large |z| means the published effect and the local data disagree by more than their combined uncertainty can explain. We used a deliberately sensitive cut-off of |z| &gt; 1.645 (two-sided p &lt; .10), since the cost of missing a conflict is higher than the cost of relaxing a prior unnecessarily.</w:t>
       </w:r>
     </w:p>
     <w:p>
@@ -13595,7 +13595,7 @@
         <w:spacing w:after="140"/>
       </w:pPr>
       <w:r>
-        <w:t xml:space="preserve">The model is confident at both ends and appropriately uncertain in the middle. The 48-year-old man with atypical pain and a flat ST slope gets a best estimate of about 21%, but with an interval from 7% to 43%, which spans the range where guidelines would recommend non-invasive testing (Knuuti et al., 2020).</w:t>
+        <w:t xml:space="preserve">The model is confident at both ends and appropriately uncertain in the middle. The 48-year-old man with atypical pain and a flat ST slope gets a best estimate of about 21%, but with an interval from 7% to 43%, which is exactly the middle range where a non-invasive test adds the most information (Knuuti et al., 2018).</w:t>
       </w:r>
     </w:p>
     <w:p>
@@ -13847,7 +13847,7 @@
         <w:t xml:space="preserve">Better-structured priors.</w:t>
       </w:r>
       <w:r>
-        <w:t xml:space="preserve"> Use a multivariate prior derived from a modern multivariable model such as Genders et al. (2011), or a shrinkage prior such as the regularised horseshoe for features without good literature.</w:t>
+        <w:t xml:space="preserve"> Use a multivariate prior derived from a modern multivariable prediction model, or a shrinkage prior such as the regularised horseshoe for features without good literature.</w:t>
       </w:r>
     </w:p>
     <w:p>
@@ -14025,25 +14025,6 @@
         <w:ind w:left="720" w:hanging="720"/>
       </w:pPr>
       <w:r>
-        <w:t xml:space="preserve">Detrano, R., Janosi, A., Steinbrunn, W., Pfisterer, M., Schmid, J.-J., Sandhu, S., Guppy, K. H., Lee, S., &amp; Froelicher, V. (1989). International application of a new probability algorithm for the diagnosis of coronary artery disease. </w:t>
-      </w:r>
-      <w:r>
-        <w:rPr>
-          <w:i/>
-          <w:iCs/>
-        </w:rPr>
-        <w:t xml:space="preserve">The American Journal of Cardiology, 64</w:t>
-      </w:r>
-      <w:r>
-        <w:t xml:space="preserve">(5), 304–310. https://doi.org/10.1016/0002-9149(89)90524-9</w:t>
-      </w:r>
-    </w:p>
-    <w:p>
-      <w:pPr>
-        <w:spacing w:after="160" w:line="300"/>
-        <w:ind w:left="720" w:hanging="720"/>
-      </w:pPr>
-      <w:r>
         <w:t xml:space="preserve">Diamond, G. A., &amp; Forrester, J. S. (1979). Analysis of probability as an aid in the clinical diagnosis of coronary-artery disease. </w:t>
       </w:r>
       <w:r>
@@ -14063,25 +14044,6 @@
         <w:ind w:left="720" w:hanging="720"/>
       </w:pPr>
       <w:r>
-        <w:t xml:space="preserve">Evans, M., &amp; Moshonov, H. (2006). Checking for prior-data conflict. </w:t>
-      </w:r>
-      <w:r>
-        <w:rPr>
-          <w:i/>
-          <w:iCs/>
-        </w:rPr>
-        <w:t xml:space="preserve">Bayesian Analysis, 1</w:t>
-      </w:r>
-      <w:r>
-        <w:t xml:space="preserve">(4), 893–914. https://doi.org/10.1214/06-BA129</w:t>
-      </w:r>
-    </w:p>
-    <w:p>
-      <w:pPr>
-        <w:spacing w:after="160" w:line="300"/>
-        <w:ind w:left="720" w:hanging="720"/>
-      </w:pPr>
-      <w:r>
         <w:t xml:space="preserve">Gelman, A., Jakulin, A., Pittau, M. G., &amp; Su, Y.-S. (2008). A weakly informative default prior distribution for logistic and other regression models. </w:t>
       </w:r>
       <w:r>
@@ -14101,25 +14063,6 @@
         <w:ind w:left="720" w:hanging="720"/>
       </w:pPr>
       <w:r>
-        <w:t xml:space="preserve">Genders, T. S. S., Steyerberg, E. W., Alkadhi, H., Leschka, S., Desbiolles, L., Nieman, K., Galema, T. W., Meijboom, W. B., Mollet, N. R., de Feyter, P. J., Cademartiri, F., Maffei, E., Dewey, M., Zimmermann, E., Laule, M., Pugliese, F., Barbagallo, R., Sinitsyn, V., Bogaert, J., . . . Hunink, M. G. M. (2011). A clinical prediction rule for the diagnosis of coronary artery disease: Validation, updating, and extension. </w:t>
-      </w:r>
-      <w:r>
-        <w:rPr>
-          <w:i/>
-          <w:iCs/>
-        </w:rPr>
-        <w:t xml:space="preserve">European Heart Journal, 32</w:t>
-      </w:r>
-      <w:r>
-        <w:t xml:space="preserve">(11), 1316–1330. https://doi.org/10.1093/eurheartj/ehr014</w:t>
-      </w:r>
-    </w:p>
-    <w:p>
-      <w:pPr>
-        <w:spacing w:after="160" w:line="300"/>
-        <w:ind w:left="720" w:hanging="720"/>
-      </w:pPr>
-      <w:r>
         <w:t xml:space="preserve">Gianrossi, R., Detrano, R., Mulvihill, D., Lehmann, K., Dubach, P., Colombo, A., McArthur, D., &amp; Froelicher, V. (1989). Exercise-induced ST depression in the diagnosis of coronary artery disease: A meta-analysis. </w:t>
       </w:r>
       <w:r>
@@ -14139,44 +14082,6 @@
         <w:ind w:left="720" w:hanging="720"/>
       </w:pPr>
       <w:r>
-        <w:t xml:space="preserve">Gibbons, R. J., Balady, G. J., Bricker, J. T., Chaitman, B. R., Fletcher, G. F., Froelicher, V. F., Mark, D. B., McCallister, B. D., Mooss, A. N., O'Reilly, M. G., Winters, W. L., Jr., Antman, E. M., Alpert, J. S., Faxon, D. P., Fuster, V., Gregoratos, G., Hiratzka, L. F., Jacobs, A. K., Russell, R. O., &amp; Smith, S. C., Jr. (2002). ACC/AHA 2002 guideline update for exercise testing: Summary article. </w:t>
-      </w:r>
-      <w:r>
-        <w:rPr>
-          <w:i/>
-          <w:iCs/>
-        </w:rPr>
-        <w:t xml:space="preserve">Circulation, 106</w:t>
-      </w:r>
-      <w:r>
-        <w:t xml:space="preserve">(14), 1883–1892. https://doi.org/10.1161/01.CIR.0000034670.06526.15</w:t>
-      </w:r>
-    </w:p>
-    <w:p>
-      <w:pPr>
-        <w:spacing w:after="160" w:line="300"/>
-        <w:ind w:left="720" w:hanging="720"/>
-      </w:pPr>
-      <w:r>
-        <w:t xml:space="preserve">Hoffman, M. D., &amp; Gelman, A. (2014). The No-U-Turn sampler: Adaptively setting path lengths in Hamiltonian Monte Carlo. </w:t>
-      </w:r>
-      <w:r>
-        <w:rPr>
-          <w:i/>
-          <w:iCs/>
-        </w:rPr>
-        <w:t xml:space="preserve">Journal of Machine Learning Research, 15</w:t>
-      </w:r>
-      <w:r>
-        <w:t xml:space="preserve">(47), 1593–1623.</w:t>
-      </w:r>
-    </w:p>
-    <w:p>
-      <w:pPr>
-        <w:spacing w:after="160" w:line="300"/>
-        <w:ind w:left="720" w:hanging="720"/>
-      </w:pPr>
-      <w:r>
         <w:t xml:space="preserve">Janosi, A., Steinbrunn, W., Pfisterer, M., &amp; Detrano, R. (1989). </w:t>
       </w:r>
       <w:r>
@@ -14215,44 +14120,6 @@
         <w:ind w:left="720" w:hanging="720"/>
       </w:pPr>
       <w:r>
-        <w:t xml:space="preserve">Knuuti, J., Wijns, W., Saraste, A., Capodanno, D., Barbato, E., Funck-Brentano, C., Prescott, E., Storey, R. F., Deaton, C., Cuisset, T., Agewall, S., Dickstein, K., Edvardsen, T., Escaned, J., Gersh, B. J., Svitil, P., Gilard, M., Hasdai, D., Hatala, R., . . . Bax, J. J. (2020). 2019 ESC guidelines for the diagnosis and management of chronic coronary syndromes. </w:t>
-      </w:r>
-      <w:r>
-        <w:rPr>
-          <w:i/>
-          <w:iCs/>
-        </w:rPr>
-        <w:t xml:space="preserve">European Heart Journal, 41</w:t>
-      </w:r>
-      <w:r>
-        <w:t xml:space="preserve">(3), 407–477. https://doi.org/10.1093/eurheartj/ehz425</w:t>
-      </w:r>
-    </w:p>
-    <w:p>
-      <w:pPr>
-        <w:spacing w:after="160" w:line="300"/>
-        <w:ind w:left="720" w:hanging="720"/>
-      </w:pPr>
-      <w:r>
-        <w:t xml:space="preserve">Kumar, R., Carroll, C., Hartikainen, A., &amp; Martin, O. (2019). ArviZ a unified library for exploratory analysis of Bayesian models in Python. </w:t>
-      </w:r>
-      <w:r>
-        <w:rPr>
-          <w:i/>
-          <w:iCs/>
-        </w:rPr>
-        <w:t xml:space="preserve">Journal of Open Source Software, 4</w:t>
-      </w:r>
-      <w:r>
-        <w:t xml:space="preserve">(33), 1143. https://doi.org/10.21105/joss.01143</w:t>
-      </w:r>
-    </w:p>
-    <w:p>
-      <w:pPr>
-        <w:spacing w:after="160" w:line="300"/>
-        <w:ind w:left="720" w:hanging="720"/>
-      </w:pPr>
-      <w:r>
         <w:t xml:space="preserve">Patel, M. R., Peterson, E. D., Dai, D., Brennan, J. M., Redberg, R. F., Anderson, H. V., Brindis, R. G., &amp; Douglas, P. S. (2010). Low diagnostic yield of elective coronary angiography. </w:t>
       </w:r>
       <w:r>
@@ -14272,25 +14139,6 @@
         <w:ind w:left="720" w:hanging="720"/>
       </w:pPr>
       <w:r>
-        <w:t xml:space="preserve">Tsao, C. W., Aday, A. W., Almarzooq, Z. I., Anderson, C. A. M., Arora, P., Avery, C. L., Baker-Smith, C. M., Beaton, A. Z., Boehme, A. K., Buxton, A. E., Commodore-Mensah, Y., Elkind, M. S. V., Evenson, K. R., Eze-Nliam, C., Fugar, S., Generoso, G., Heard, D. G., Hiremath, S., Ho, J. E., . . . Martin, S. S. (2023). Heart disease and stroke statistics—2023 update: A report from the American Heart Association. </w:t>
-      </w:r>
-      <w:r>
-        <w:rPr>
-          <w:i/>
-          <w:iCs/>
-        </w:rPr>
-        <w:t xml:space="preserve">Circulation, 147</w:t>
-      </w:r>
-      <w:r>
-        <w:t xml:space="preserve">(8), e93–e621. https://doi.org/10.1161/CIR.0000000000001123</w:t>
-      </w:r>
-    </w:p>
-    <w:p>
-      <w:pPr>
-        <w:spacing w:after="160" w:line="300"/>
-        <w:ind w:left="720" w:hanging="720"/>
-      </w:pPr>
-      <w:r>
         <w:t xml:space="preserve">Vehtari, A., Gelman, A., &amp; Gabry, J. (2017). Practical Bayesian model evaluation using leave-one-out cross-validation and WAIC. </w:t>
       </w:r>
       <w:r>
@@ -14302,25 +14150,6 @@
       </w:r>
       <w:r>
         <w:t xml:space="preserve">(5), 1413–1432. https://doi.org/10.1007/s11222-016-9696-4</w:t>
-      </w:r>
-    </w:p>
-    <w:p>
-      <w:pPr>
-        <w:spacing w:after="160" w:line="300"/>
-        <w:ind w:left="720" w:hanging="720"/>
-      </w:pPr>
-      <w:r>
-        <w:t xml:space="preserve">Wilson, P. W. F., D'Agostino, R. B., Levy, D., Belanger, A. M., Silbershatz, H., &amp; Kannel, W. B. (1998). Prediction of coronary heart disease using risk factor categories. </w:t>
-      </w:r>
-      <w:r>
-        <w:rPr>
-          <w:i/>
-          <w:iCs/>
-        </w:rPr>
-        <w:t xml:space="preserve">Circulation, 97</w:t>
-      </w:r>
-      <w:r>
-        <w:t xml:space="preserve">(18), 1837–1847. https://doi.org/10.1161/01.CIR.97.18.1837</w:t>
       </w:r>
     </w:p>
     <w:p>

</xml_diff>